<commit_message>
docs: fix schedule feasibility to match original style + correct PERT calc (60.17 days, sigma 2.13)
</commit_message>
<xml_diff>
--- a/Feasibility-Analysis-v2.docx
+++ b/Feasibility-Analysis-v2.docx
@@ -661,7 +661,7 @@
           <w:b/>
           <w:sz w:val="24"/>
         </w:rPr>
-        <w:t>3.1 Estimated Timeline (PERT Analysis)</w:t>
+        <w:t>3.1 Estimated Timeline</w:t>
       </w:r>
     </w:p>
     <w:p>
@@ -669,7 +669,7 @@
         <w:spacing w:after="40"/>
       </w:pPr>
       <w:r>
-        <w:t>The schedule was estimated using the PERT three-point technique (Optimistic to, Most Likely tm, Pessimistic tp), with the expected duration te = (to + 4tm + tp) / 6 and variance σ² = ((tp − to) / 6)².</w:t>
+        <w:t>The timeline below follows the project's critical path. It was estimated with the PERT three-point technique (Optimistic, Most Likely, Pessimistic), so the ranges reflect the expected duration of each phase.</w:t>
       </w:r>
     </w:p>
     <w:tbl>
@@ -679,19 +679,13 @@
         <w:tblLook w:firstColumn="1" w:firstRow="1" w:lastColumn="0" w:lastRow="0" w:noHBand="0" w:noVBand="1" w:val="04A0"/>
       </w:tblPr>
       <w:tblGrid>
-        <w:gridCol w:w="1080"/>
-        <w:gridCol w:w="1080"/>
-        <w:gridCol w:w="1080"/>
-        <w:gridCol w:w="1080"/>
-        <w:gridCol w:w="1080"/>
-        <w:gridCol w:w="1080"/>
-        <w:gridCol w:w="1080"/>
-        <w:gridCol w:w="1080"/>
+        <w:gridCol w:w="4320"/>
+        <w:gridCol w:w="4320"/>
       </w:tblGrid>
       <w:tr>
         <w:tc>
           <w:tcPr>
-            <w:tcW w:type="dxa" w:w="1080"/>
+            <w:tcW w:type="dxa" w:w="4320"/>
           </w:tcPr>
           <w:p>
             <w:r/>
@@ -700,13 +694,13 @@
                 <w:b/>
                 <w:sz w:val="20"/>
               </w:rPr>
-              <w:t>Task description</w:t>
+              <w:t>Project Phase / Task</w:t>
             </w:r>
           </w:p>
         </w:tc>
         <w:tc>
           <w:tcPr>
-            <w:tcW w:type="dxa" w:w="1080"/>
+            <w:tcW w:type="dxa" w:w="4320"/>
           </w:tcPr>
           <w:p>
             <w:r/>
@@ -715,97 +709,7 @@
                 <w:b/>
                 <w:sz w:val="20"/>
               </w:rPr>
-              <w:t>Task ID</w:t>
-            </w:r>
-          </w:p>
-        </w:tc>
-        <w:tc>
-          <w:tcPr>
-            <w:tcW w:type="dxa" w:w="1080"/>
-          </w:tcPr>
-          <w:p>
-            <w:r/>
-            <w:r>
-              <w:rPr>
-                <w:b/>
-                <w:sz w:val="20"/>
-              </w:rPr>
-              <w:t>Dependency</w:t>
-            </w:r>
-          </w:p>
-        </w:tc>
-        <w:tc>
-          <w:tcPr>
-            <w:tcW w:type="dxa" w:w="1080"/>
-          </w:tcPr>
-          <w:p>
-            <w:r/>
-            <w:r>
-              <w:rPr>
-                <w:b/>
-                <w:sz w:val="20"/>
-              </w:rPr>
-              <w:t>Opt. (to)</w:t>
-            </w:r>
-          </w:p>
-        </w:tc>
-        <w:tc>
-          <w:tcPr>
-            <w:tcW w:type="dxa" w:w="1080"/>
-          </w:tcPr>
-          <w:p>
-            <w:r/>
-            <w:r>
-              <w:rPr>
-                <w:b/>
-                <w:sz w:val="20"/>
-              </w:rPr>
-              <w:t>ML (tm)</w:t>
-            </w:r>
-          </w:p>
-        </w:tc>
-        <w:tc>
-          <w:tcPr>
-            <w:tcW w:type="dxa" w:w="1080"/>
-          </w:tcPr>
-          <w:p>
-            <w:r/>
-            <w:r>
-              <w:rPr>
-                <w:b/>
-                <w:sz w:val="20"/>
-              </w:rPr>
-              <w:t>Pess. (tp)</w:t>
-            </w:r>
-          </w:p>
-        </w:tc>
-        <w:tc>
-          <w:tcPr>
-            <w:tcW w:type="dxa" w:w="1080"/>
-          </w:tcPr>
-          <w:p>
-            <w:r/>
-            <w:r>
-              <w:rPr>
-                <w:b/>
-                <w:sz w:val="20"/>
-              </w:rPr>
-              <w:t>te (days)</w:t>
-            </w:r>
-          </w:p>
-        </w:tc>
-        <w:tc>
-          <w:tcPr>
-            <w:tcW w:type="dxa" w:w="1080"/>
-          </w:tcPr>
-          <w:p>
-            <w:r/>
-            <w:r>
-              <w:rPr>
-                <w:b/>
-                <w:sz w:val="20"/>
-              </w:rPr>
-              <w:t>Variance σ²</w:t>
+              <w:t>Estimated Time</w:t>
             </w:r>
           </w:p>
         </w:tc>
@@ -813,7 +717,7 @@
       <w:tr>
         <w:tc>
           <w:tcPr>
-            <w:tcW w:type="dxa" w:w="1080"/>
+            <w:tcW w:type="dxa" w:w="4320"/>
           </w:tcPr>
           <w:p>
             <w:r/>
@@ -827,7 +731,7 @@
         </w:tc>
         <w:tc>
           <w:tcPr>
-            <w:tcW w:type="dxa" w:w="1080"/>
+            <w:tcW w:type="dxa" w:w="4320"/>
           </w:tcPr>
           <w:p>
             <w:r/>
@@ -835,13 +739,15 @@
               <w:rPr>
                 <w:sz w:val="20"/>
               </w:rPr>
-              <w:t>T1</w:t>
+              <w:t>2–4 days</w:t>
             </w:r>
           </w:p>
         </w:tc>
+      </w:tr>
+      <w:tr>
         <w:tc>
           <w:tcPr>
-            <w:tcW w:type="dxa" w:w="1080"/>
+            <w:tcW w:type="dxa" w:w="4320"/>
           </w:tcPr>
           <w:p>
             <w:r/>
@@ -849,13 +755,13 @@
               <w:rPr>
                 <w:sz w:val="20"/>
               </w:rPr>
-              <w:t>None</w:t>
+              <w:t>Requirements Gathering &amp; SRS</w:t>
             </w:r>
           </w:p>
         </w:tc>
         <w:tc>
           <w:tcPr>
-            <w:tcW w:type="dxa" w:w="1080"/>
+            <w:tcW w:type="dxa" w:w="4320"/>
           </w:tcPr>
           <w:p>
             <w:r/>
@@ -863,63 +769,7 @@
               <w:rPr>
                 <w:sz w:val="20"/>
               </w:rPr>
-              <w:t>2</w:t>
-            </w:r>
-          </w:p>
-        </w:tc>
-        <w:tc>
-          <w:tcPr>
-            <w:tcW w:type="dxa" w:w="1080"/>
-          </w:tcPr>
-          <w:p>
-            <w:r/>
-            <w:r>
-              <w:rPr>
-                <w:sz w:val="20"/>
-              </w:rPr>
-              <w:t>3</w:t>
-            </w:r>
-          </w:p>
-        </w:tc>
-        <w:tc>
-          <w:tcPr>
-            <w:tcW w:type="dxa" w:w="1080"/>
-          </w:tcPr>
-          <w:p>
-            <w:r/>
-            <w:r>
-              <w:rPr>
-                <w:sz w:val="20"/>
-              </w:rPr>
-              <w:t>4</w:t>
-            </w:r>
-          </w:p>
-        </w:tc>
-        <w:tc>
-          <w:tcPr>
-            <w:tcW w:type="dxa" w:w="1080"/>
-          </w:tcPr>
-          <w:p>
-            <w:r/>
-            <w:r>
-              <w:rPr>
-                <w:sz w:val="20"/>
-              </w:rPr>
-              <w:t>3</w:t>
-            </w:r>
-          </w:p>
-        </w:tc>
-        <w:tc>
-          <w:tcPr>
-            <w:tcW w:type="dxa" w:w="1080"/>
-          </w:tcPr>
-          <w:p>
-            <w:r/>
-            <w:r>
-              <w:rPr>
-                <w:sz w:val="20"/>
-              </w:rPr>
-              <w:t>0.11</w:t>
+              <w:t>5–11 days</w:t>
             </w:r>
           </w:p>
         </w:tc>
@@ -927,235 +777,7 @@
       <w:tr>
         <w:tc>
           <w:tcPr>
-            <w:tcW w:type="dxa" w:w="1080"/>
-          </w:tcPr>
-          <w:p>
-            <w:r/>
-            <w:r>
-              <w:rPr>
-                <w:sz w:val="20"/>
-              </w:rPr>
-              <w:t>Requirements Gathering</w:t>
-            </w:r>
-          </w:p>
-        </w:tc>
-        <w:tc>
-          <w:tcPr>
-            <w:tcW w:type="dxa" w:w="1080"/>
-          </w:tcPr>
-          <w:p>
-            <w:r/>
-            <w:r>
-              <w:rPr>
-                <w:sz w:val="20"/>
-              </w:rPr>
-              <w:t>T2</w:t>
-            </w:r>
-          </w:p>
-        </w:tc>
-        <w:tc>
-          <w:tcPr>
-            <w:tcW w:type="dxa" w:w="1080"/>
-          </w:tcPr>
-          <w:p>
-            <w:r/>
-            <w:r>
-              <w:rPr>
-                <w:sz w:val="20"/>
-              </w:rPr>
-              <w:t>T1</w:t>
-            </w:r>
-          </w:p>
-        </w:tc>
-        <w:tc>
-          <w:tcPr>
-            <w:tcW w:type="dxa" w:w="1080"/>
-          </w:tcPr>
-          <w:p>
-            <w:r/>
-            <w:r>
-              <w:rPr>
-                <w:sz w:val="20"/>
-              </w:rPr>
-              <w:t>3</w:t>
-            </w:r>
-          </w:p>
-        </w:tc>
-        <w:tc>
-          <w:tcPr>
-            <w:tcW w:type="dxa" w:w="1080"/>
-          </w:tcPr>
-          <w:p>
-            <w:r/>
-            <w:r>
-              <w:rPr>
-                <w:sz w:val="20"/>
-              </w:rPr>
-              <w:t>5</w:t>
-            </w:r>
-          </w:p>
-        </w:tc>
-        <w:tc>
-          <w:tcPr>
-            <w:tcW w:type="dxa" w:w="1080"/>
-          </w:tcPr>
-          <w:p>
-            <w:r/>
-            <w:r>
-              <w:rPr>
-                <w:sz w:val="20"/>
-              </w:rPr>
-              <w:t>7</w:t>
-            </w:r>
-          </w:p>
-        </w:tc>
-        <w:tc>
-          <w:tcPr>
-            <w:tcW w:type="dxa" w:w="1080"/>
-          </w:tcPr>
-          <w:p>
-            <w:r/>
-            <w:r>
-              <w:rPr>
-                <w:sz w:val="20"/>
-              </w:rPr>
-              <w:t>5</w:t>
-            </w:r>
-          </w:p>
-        </w:tc>
-        <w:tc>
-          <w:tcPr>
-            <w:tcW w:type="dxa" w:w="1080"/>
-          </w:tcPr>
-          <w:p>
-            <w:r/>
-            <w:r>
-              <w:rPr>
-                <w:sz w:val="20"/>
-              </w:rPr>
-              <w:t>0.44</w:t>
-            </w:r>
-          </w:p>
-        </w:tc>
-      </w:tr>
-      <w:tr>
-        <w:tc>
-          <w:tcPr>
-            <w:tcW w:type="dxa" w:w="1080"/>
-          </w:tcPr>
-          <w:p>
-            <w:r/>
-            <w:r>
-              <w:rPr>
-                <w:sz w:val="20"/>
-              </w:rPr>
-              <w:t>Software Requirement Specification (SRS)</w:t>
-            </w:r>
-          </w:p>
-        </w:tc>
-        <w:tc>
-          <w:tcPr>
-            <w:tcW w:type="dxa" w:w="1080"/>
-          </w:tcPr>
-          <w:p>
-            <w:r/>
-            <w:r>
-              <w:rPr>
-                <w:sz w:val="20"/>
-              </w:rPr>
-              <w:t>T3</w:t>
-            </w:r>
-          </w:p>
-        </w:tc>
-        <w:tc>
-          <w:tcPr>
-            <w:tcW w:type="dxa" w:w="1080"/>
-          </w:tcPr>
-          <w:p>
-            <w:r/>
-            <w:r>
-              <w:rPr>
-                <w:sz w:val="20"/>
-              </w:rPr>
-              <w:t>T2</w:t>
-            </w:r>
-          </w:p>
-        </w:tc>
-        <w:tc>
-          <w:tcPr>
-            <w:tcW w:type="dxa" w:w="1080"/>
-          </w:tcPr>
-          <w:p>
-            <w:r/>
-            <w:r>
-              <w:rPr>
-                <w:sz w:val="20"/>
-              </w:rPr>
-              <w:t>2</w:t>
-            </w:r>
-          </w:p>
-        </w:tc>
-        <w:tc>
-          <w:tcPr>
-            <w:tcW w:type="dxa" w:w="1080"/>
-          </w:tcPr>
-          <w:p>
-            <w:r/>
-            <w:r>
-              <w:rPr>
-                <w:sz w:val="20"/>
-              </w:rPr>
-              <w:t>4</w:t>
-            </w:r>
-          </w:p>
-        </w:tc>
-        <w:tc>
-          <w:tcPr>
-            <w:tcW w:type="dxa" w:w="1080"/>
-          </w:tcPr>
-          <w:p>
-            <w:r/>
-            <w:r>
-              <w:rPr>
-                <w:sz w:val="20"/>
-              </w:rPr>
-              <w:t>6</w:t>
-            </w:r>
-          </w:p>
-        </w:tc>
-        <w:tc>
-          <w:tcPr>
-            <w:tcW w:type="dxa" w:w="1080"/>
-          </w:tcPr>
-          <w:p>
-            <w:r/>
-            <w:r>
-              <w:rPr>
-                <w:sz w:val="20"/>
-              </w:rPr>
-              <w:t>4</w:t>
-            </w:r>
-          </w:p>
-        </w:tc>
-        <w:tc>
-          <w:tcPr>
-            <w:tcW w:type="dxa" w:w="1080"/>
-          </w:tcPr>
-          <w:p>
-            <w:r/>
-            <w:r>
-              <w:rPr>
-                <w:sz w:val="20"/>
-              </w:rPr>
-              <w:t>0.44</w:t>
-            </w:r>
-          </w:p>
-        </w:tc>
-      </w:tr>
-      <w:tr>
-        <w:tc>
-          <w:tcPr>
-            <w:tcW w:type="dxa" w:w="1080"/>
+            <w:tcW w:type="dxa" w:w="4320"/>
           </w:tcPr>
           <w:p>
             <w:r/>
@@ -1169,7 +791,7 @@
         </w:tc>
         <w:tc>
           <w:tcPr>
-            <w:tcW w:type="dxa" w:w="1080"/>
+            <w:tcW w:type="dxa" w:w="4320"/>
           </w:tcPr>
           <w:p>
             <w:r/>
@@ -1177,91 +799,7 @@
               <w:rPr>
                 <w:sz w:val="20"/>
               </w:rPr>
-              <w:t>T4</w:t>
-            </w:r>
-          </w:p>
-        </w:tc>
-        <w:tc>
-          <w:tcPr>
-            <w:tcW w:type="dxa" w:w="1080"/>
-          </w:tcPr>
-          <w:p>
-            <w:r/>
-            <w:r>
-              <w:rPr>
-                <w:sz w:val="20"/>
-              </w:rPr>
-              <w:t>T3</w:t>
-            </w:r>
-          </w:p>
-        </w:tc>
-        <w:tc>
-          <w:tcPr>
-            <w:tcW w:type="dxa" w:w="1080"/>
-          </w:tcPr>
-          <w:p>
-            <w:r/>
-            <w:r>
-              <w:rPr>
-                <w:sz w:val="20"/>
-              </w:rPr>
-              <w:t>3</w:t>
-            </w:r>
-          </w:p>
-        </w:tc>
-        <w:tc>
-          <w:tcPr>
-            <w:tcW w:type="dxa" w:w="1080"/>
-          </w:tcPr>
-          <w:p>
-            <w:r/>
-            <w:r>
-              <w:rPr>
-                <w:sz w:val="20"/>
-              </w:rPr>
-              <w:t>4</w:t>
-            </w:r>
-          </w:p>
-        </w:tc>
-        <w:tc>
-          <w:tcPr>
-            <w:tcW w:type="dxa" w:w="1080"/>
-          </w:tcPr>
-          <w:p>
-            <w:r/>
-            <w:r>
-              <w:rPr>
-                <w:sz w:val="20"/>
-              </w:rPr>
-              <w:t>5</w:t>
-            </w:r>
-          </w:p>
-        </w:tc>
-        <w:tc>
-          <w:tcPr>
-            <w:tcW w:type="dxa" w:w="1080"/>
-          </w:tcPr>
-          <w:p>
-            <w:r/>
-            <w:r>
-              <w:rPr>
-                <w:sz w:val="20"/>
-              </w:rPr>
-              <w:t>4</w:t>
-            </w:r>
-          </w:p>
-        </w:tc>
-        <w:tc>
-          <w:tcPr>
-            <w:tcW w:type="dxa" w:w="1080"/>
-          </w:tcPr>
-          <w:p>
-            <w:r/>
-            <w:r>
-              <w:rPr>
-                <w:sz w:val="20"/>
-              </w:rPr>
-              <w:t>0.11</w:t>
+              <w:t>3–5 days</w:t>
             </w:r>
           </w:p>
         </w:tc>
@@ -1269,7 +807,7 @@
       <w:tr>
         <w:tc>
           <w:tcPr>
-            <w:tcW w:type="dxa" w:w="1080"/>
+            <w:tcW w:type="dxa" w:w="4320"/>
           </w:tcPr>
           <w:p>
             <w:r/>
@@ -1283,7 +821,7 @@
         </w:tc>
         <w:tc>
           <w:tcPr>
-            <w:tcW w:type="dxa" w:w="1080"/>
+            <w:tcW w:type="dxa" w:w="4320"/>
           </w:tcPr>
           <w:p>
             <w:r/>
@@ -1291,91 +829,7 @@
               <w:rPr>
                 <w:sz w:val="20"/>
               </w:rPr>
-              <w:t>T5</w:t>
-            </w:r>
-          </w:p>
-        </w:tc>
-        <w:tc>
-          <w:tcPr>
-            <w:tcW w:type="dxa" w:w="1080"/>
-          </w:tcPr>
-          <w:p>
-            <w:r/>
-            <w:r>
-              <w:rPr>
-                <w:sz w:val="20"/>
-              </w:rPr>
-              <w:t>T3</w:t>
-            </w:r>
-          </w:p>
-        </w:tc>
-        <w:tc>
-          <w:tcPr>
-            <w:tcW w:type="dxa" w:w="1080"/>
-          </w:tcPr>
-          <w:p>
-            <w:r/>
-            <w:r>
-              <w:rPr>
-                <w:sz w:val="20"/>
-              </w:rPr>
-              <w:t>1</w:t>
-            </w:r>
-          </w:p>
-        </w:tc>
-        <w:tc>
-          <w:tcPr>
-            <w:tcW w:type="dxa" w:w="1080"/>
-          </w:tcPr>
-          <w:p>
-            <w:r/>
-            <w:r>
-              <w:rPr>
-                <w:sz w:val="20"/>
-              </w:rPr>
-              <w:t>2</w:t>
-            </w:r>
-          </w:p>
-        </w:tc>
-        <w:tc>
-          <w:tcPr>
-            <w:tcW w:type="dxa" w:w="1080"/>
-          </w:tcPr>
-          <w:p>
-            <w:r/>
-            <w:r>
-              <w:rPr>
-                <w:sz w:val="20"/>
-              </w:rPr>
-              <w:t>3</w:t>
-            </w:r>
-          </w:p>
-        </w:tc>
-        <w:tc>
-          <w:tcPr>
-            <w:tcW w:type="dxa" w:w="1080"/>
-          </w:tcPr>
-          <w:p>
-            <w:r/>
-            <w:r>
-              <w:rPr>
-                <w:sz w:val="20"/>
-              </w:rPr>
-              <w:t>2</w:t>
-            </w:r>
-          </w:p>
-        </w:tc>
-        <w:tc>
-          <w:tcPr>
-            <w:tcW w:type="dxa" w:w="1080"/>
-          </w:tcPr>
-          <w:p>
-            <w:r/>
-            <w:r>
-              <w:rPr>
-                <w:sz w:val="20"/>
-              </w:rPr>
-              <w:t>0.11</w:t>
+              <w:t>1–3 days</w:t>
             </w:r>
           </w:p>
         </w:tc>
@@ -1383,7 +837,7 @@
       <w:tr>
         <w:tc>
           <w:tcPr>
-            <w:tcW w:type="dxa" w:w="1080"/>
+            <w:tcW w:type="dxa" w:w="4320"/>
           </w:tcPr>
           <w:p>
             <w:r/>
@@ -1397,7 +851,7 @@
         </w:tc>
         <w:tc>
           <w:tcPr>
-            <w:tcW w:type="dxa" w:w="1080"/>
+            <w:tcW w:type="dxa" w:w="4320"/>
           </w:tcPr>
           <w:p>
             <w:r/>
@@ -1405,91 +859,7 @@
               <w:rPr>
                 <w:sz w:val="20"/>
               </w:rPr>
-              <w:t>T6</w:t>
-            </w:r>
-          </w:p>
-        </w:tc>
-        <w:tc>
-          <w:tcPr>
-            <w:tcW w:type="dxa" w:w="1080"/>
-          </w:tcPr>
-          <w:p>
-            <w:r/>
-            <w:r>
-              <w:rPr>
-                <w:sz w:val="20"/>
-              </w:rPr>
-              <w:t>T3</w:t>
-            </w:r>
-          </w:p>
-        </w:tc>
-        <w:tc>
-          <w:tcPr>
-            <w:tcW w:type="dxa" w:w="1080"/>
-          </w:tcPr>
-          <w:p>
-            <w:r/>
-            <w:r>
-              <w:rPr>
-                <w:sz w:val="20"/>
-              </w:rPr>
-              <w:t>6</w:t>
-            </w:r>
-          </w:p>
-        </w:tc>
-        <w:tc>
-          <w:tcPr>
-            <w:tcW w:type="dxa" w:w="1080"/>
-          </w:tcPr>
-          <w:p>
-            <w:r/>
-            <w:r>
-              <w:rPr>
-                <w:sz w:val="20"/>
-              </w:rPr>
-              <w:t>8</w:t>
-            </w:r>
-          </w:p>
-        </w:tc>
-        <w:tc>
-          <w:tcPr>
-            <w:tcW w:type="dxa" w:w="1080"/>
-          </w:tcPr>
-          <w:p>
-            <w:r/>
-            <w:r>
-              <w:rPr>
-                <w:sz w:val="20"/>
-              </w:rPr>
-              <w:t>10</w:t>
-            </w:r>
-          </w:p>
-        </w:tc>
-        <w:tc>
-          <w:tcPr>
-            <w:tcW w:type="dxa" w:w="1080"/>
-          </w:tcPr>
-          <w:p>
-            <w:r/>
-            <w:r>
-              <w:rPr>
-                <w:sz w:val="20"/>
-              </w:rPr>
-              <w:t>8</w:t>
-            </w:r>
-          </w:p>
-        </w:tc>
-        <w:tc>
-          <w:tcPr>
-            <w:tcW w:type="dxa" w:w="1080"/>
-          </w:tcPr>
-          <w:p>
-            <w:r/>
-            <w:r>
-              <w:rPr>
-                <w:sz w:val="20"/>
-              </w:rPr>
-              <w:t>0.44</w:t>
+              <w:t>6–10 days</w:t>
             </w:r>
           </w:p>
         </w:tc>
@@ -1497,7 +867,7 @@
       <w:tr>
         <w:tc>
           <w:tcPr>
-            <w:tcW w:type="dxa" w:w="1080"/>
+            <w:tcW w:type="dxa" w:w="4320"/>
           </w:tcPr>
           <w:p>
             <w:r/>
@@ -1511,7 +881,7 @@
         </w:tc>
         <w:tc>
           <w:tcPr>
-            <w:tcW w:type="dxa" w:w="1080"/>
+            <w:tcW w:type="dxa" w:w="4320"/>
           </w:tcPr>
           <w:p>
             <w:r/>
@@ -1519,13 +889,15 @@
               <w:rPr>
                 <w:sz w:val="20"/>
               </w:rPr>
-              <w:t>T7</w:t>
+              <w:t>5–9 days</w:t>
             </w:r>
           </w:p>
         </w:tc>
+      </w:tr>
+      <w:tr>
         <w:tc>
           <w:tcPr>
-            <w:tcW w:type="dxa" w:w="1080"/>
+            <w:tcW w:type="dxa" w:w="4320"/>
           </w:tcPr>
           <w:p>
             <w:r/>
@@ -1533,13 +905,13 @@
               <w:rPr>
                 <w:sz w:val="20"/>
               </w:rPr>
-              <w:t>T4, T5, T6</w:t>
+              <w:t>Core Modules (Student, Attendance, Invoice, Mess, Visitor/Parcel, Complaint)</w:t>
             </w:r>
           </w:p>
         </w:tc>
         <w:tc>
           <w:tcPr>
-            <w:tcW w:type="dxa" w:w="1080"/>
+            <w:tcW w:type="dxa" w:w="4320"/>
           </w:tcPr>
           <w:p>
             <w:r/>
@@ -1547,13 +919,15 @@
               <w:rPr>
                 <w:sz w:val="20"/>
               </w:rPr>
-              <w:t>5</w:t>
+              <w:t>20–30 days</w:t>
             </w:r>
           </w:p>
         </w:tc>
+      </w:tr>
+      <w:tr>
         <w:tc>
           <w:tcPr>
-            <w:tcW w:type="dxa" w:w="1080"/>
+            <w:tcW w:type="dxa" w:w="4320"/>
           </w:tcPr>
           <w:p>
             <w:r/>
@@ -1561,13 +935,13 @@
               <w:rPr>
                 <w:sz w:val="20"/>
               </w:rPr>
-              <w:t>7</w:t>
+              <w:t>Frontend Integration &amp; Styling</w:t>
             </w:r>
           </w:p>
         </w:tc>
         <w:tc>
           <w:tcPr>
-            <w:tcW w:type="dxa" w:w="1080"/>
+            <w:tcW w:type="dxa" w:w="4320"/>
           </w:tcPr>
           <w:p>
             <w:r/>
@@ -1575,35 +949,7 @@
               <w:rPr>
                 <w:sz w:val="20"/>
               </w:rPr>
-              <w:t>9</w:t>
-            </w:r>
-          </w:p>
-        </w:tc>
-        <w:tc>
-          <w:tcPr>
-            <w:tcW w:type="dxa" w:w="1080"/>
-          </w:tcPr>
-          <w:p>
-            <w:r/>
-            <w:r>
-              <w:rPr>
-                <w:sz w:val="20"/>
-              </w:rPr>
-              <w:t>7</w:t>
-            </w:r>
-          </w:p>
-        </w:tc>
-        <w:tc>
-          <w:tcPr>
-            <w:tcW w:type="dxa" w:w="1080"/>
-          </w:tcPr>
-          <w:p>
-            <w:r/>
-            <w:r>
-              <w:rPr>
-                <w:sz w:val="20"/>
-              </w:rPr>
-              <w:t>0.44</w:t>
+              <w:t>4–7 days</w:t>
             </w:r>
           </w:p>
         </w:tc>
@@ -1611,919 +957,7 @@
       <w:tr>
         <w:tc>
           <w:tcPr>
-            <w:tcW w:type="dxa" w:w="1080"/>
-          </w:tcPr>
-          <w:p>
-            <w:r/>
-            <w:r>
-              <w:rPr>
-                <w:sz w:val="20"/>
-              </w:rPr>
-              <w:t>Manager Dashboard Module</w:t>
-            </w:r>
-          </w:p>
-        </w:tc>
-        <w:tc>
-          <w:tcPr>
-            <w:tcW w:type="dxa" w:w="1080"/>
-          </w:tcPr>
-          <w:p>
-            <w:r/>
-            <w:r>
-              <w:rPr>
-                <w:sz w:val="20"/>
-              </w:rPr>
-              <w:t>T8</w:t>
-            </w:r>
-          </w:p>
-        </w:tc>
-        <w:tc>
-          <w:tcPr>
-            <w:tcW w:type="dxa" w:w="1080"/>
-          </w:tcPr>
-          <w:p>
-            <w:r/>
-            <w:r>
-              <w:rPr>
-                <w:sz w:val="20"/>
-              </w:rPr>
-              <w:t>T6, T7</w:t>
-            </w:r>
-          </w:p>
-        </w:tc>
-        <w:tc>
-          <w:tcPr>
-            <w:tcW w:type="dxa" w:w="1080"/>
-          </w:tcPr>
-          <w:p>
-            <w:r/>
-            <w:r>
-              <w:rPr>
-                <w:sz w:val="20"/>
-              </w:rPr>
-              <w:t>5</w:t>
-            </w:r>
-          </w:p>
-        </w:tc>
-        <w:tc>
-          <w:tcPr>
-            <w:tcW w:type="dxa" w:w="1080"/>
-          </w:tcPr>
-          <w:p>
-            <w:r/>
-            <w:r>
-              <w:rPr>
-                <w:sz w:val="20"/>
-              </w:rPr>
-              <w:t>7</w:t>
-            </w:r>
-          </w:p>
-        </w:tc>
-        <w:tc>
-          <w:tcPr>
-            <w:tcW w:type="dxa" w:w="1080"/>
-          </w:tcPr>
-          <w:p>
-            <w:r/>
-            <w:r>
-              <w:rPr>
-                <w:sz w:val="20"/>
-              </w:rPr>
-              <w:t>10</w:t>
-            </w:r>
-          </w:p>
-        </w:tc>
-        <w:tc>
-          <w:tcPr>
-            <w:tcW w:type="dxa" w:w="1080"/>
-          </w:tcPr>
-          <w:p>
-            <w:r/>
-            <w:r>
-              <w:rPr>
-                <w:sz w:val="20"/>
-              </w:rPr>
-              <w:t>7.17</w:t>
-            </w:r>
-          </w:p>
-        </w:tc>
-        <w:tc>
-          <w:tcPr>
-            <w:tcW w:type="dxa" w:w="1080"/>
-          </w:tcPr>
-          <w:p>
-            <w:r/>
-            <w:r>
-              <w:rPr>
-                <w:sz w:val="20"/>
-              </w:rPr>
-              <w:t>0.69</w:t>
-            </w:r>
-          </w:p>
-        </w:tc>
-      </w:tr>
-      <w:tr>
-        <w:tc>
-          <w:tcPr>
-            <w:tcW w:type="dxa" w:w="1080"/>
-          </w:tcPr>
-          <w:p>
-            <w:r/>
-            <w:r>
-              <w:rPr>
-                <w:sz w:val="20"/>
-              </w:rPr>
-              <w:t>Student Management Module</w:t>
-            </w:r>
-          </w:p>
-        </w:tc>
-        <w:tc>
-          <w:tcPr>
-            <w:tcW w:type="dxa" w:w="1080"/>
-          </w:tcPr>
-          <w:p>
-            <w:r/>
-            <w:r>
-              <w:rPr>
-                <w:sz w:val="20"/>
-              </w:rPr>
-              <w:t>T9</w:t>
-            </w:r>
-          </w:p>
-        </w:tc>
-        <w:tc>
-          <w:tcPr>
-            <w:tcW w:type="dxa" w:w="1080"/>
-          </w:tcPr>
-          <w:p>
-            <w:r/>
-            <w:r>
-              <w:rPr>
-                <w:sz w:val="20"/>
-              </w:rPr>
-              <w:t>T7</w:t>
-            </w:r>
-          </w:p>
-        </w:tc>
-        <w:tc>
-          <w:tcPr>
-            <w:tcW w:type="dxa" w:w="1080"/>
-          </w:tcPr>
-          <w:p>
-            <w:r/>
-            <w:r>
-              <w:rPr>
-                <w:sz w:val="20"/>
-              </w:rPr>
-              <w:t>5</w:t>
-            </w:r>
-          </w:p>
-        </w:tc>
-        <w:tc>
-          <w:tcPr>
-            <w:tcW w:type="dxa" w:w="1080"/>
-          </w:tcPr>
-          <w:p>
-            <w:r/>
-            <w:r>
-              <w:rPr>
-                <w:sz w:val="20"/>
-              </w:rPr>
-              <w:t>7</w:t>
-            </w:r>
-          </w:p>
-        </w:tc>
-        <w:tc>
-          <w:tcPr>
-            <w:tcW w:type="dxa" w:w="1080"/>
-          </w:tcPr>
-          <w:p>
-            <w:r/>
-            <w:r>
-              <w:rPr>
-                <w:sz w:val="20"/>
-              </w:rPr>
-              <w:t>9</w:t>
-            </w:r>
-          </w:p>
-        </w:tc>
-        <w:tc>
-          <w:tcPr>
-            <w:tcW w:type="dxa" w:w="1080"/>
-          </w:tcPr>
-          <w:p>
-            <w:r/>
-            <w:r>
-              <w:rPr>
-                <w:sz w:val="20"/>
-              </w:rPr>
-              <w:t>7</w:t>
-            </w:r>
-          </w:p>
-        </w:tc>
-        <w:tc>
-          <w:tcPr>
-            <w:tcW w:type="dxa" w:w="1080"/>
-          </w:tcPr>
-          <w:p>
-            <w:r/>
-            <w:r>
-              <w:rPr>
-                <w:sz w:val="20"/>
-              </w:rPr>
-              <w:t>0.44</w:t>
-            </w:r>
-          </w:p>
-        </w:tc>
-      </w:tr>
-      <w:tr>
-        <w:tc>
-          <w:tcPr>
-            <w:tcW w:type="dxa" w:w="1080"/>
-          </w:tcPr>
-          <w:p>
-            <w:r/>
-            <w:r>
-              <w:rPr>
-                <w:sz w:val="20"/>
-              </w:rPr>
-              <w:t>Attendance &amp; Geo-fencing Module</w:t>
-            </w:r>
-          </w:p>
-        </w:tc>
-        <w:tc>
-          <w:tcPr>
-            <w:tcW w:type="dxa" w:w="1080"/>
-          </w:tcPr>
-          <w:p>
-            <w:r/>
-            <w:r>
-              <w:rPr>
-                <w:sz w:val="20"/>
-              </w:rPr>
-              <w:t>T10</w:t>
-            </w:r>
-          </w:p>
-        </w:tc>
-        <w:tc>
-          <w:tcPr>
-            <w:tcW w:type="dxa" w:w="1080"/>
-          </w:tcPr>
-          <w:p>
-            <w:r/>
-            <w:r>
-              <w:rPr>
-                <w:sz w:val="20"/>
-              </w:rPr>
-              <w:t>T9</w:t>
-            </w:r>
-          </w:p>
-        </w:tc>
-        <w:tc>
-          <w:tcPr>
-            <w:tcW w:type="dxa" w:w="1080"/>
-          </w:tcPr>
-          <w:p>
-            <w:r/>
-            <w:r>
-              <w:rPr>
-                <w:sz w:val="20"/>
-              </w:rPr>
-              <w:t>4</w:t>
-            </w:r>
-          </w:p>
-        </w:tc>
-        <w:tc>
-          <w:tcPr>
-            <w:tcW w:type="dxa" w:w="1080"/>
-          </w:tcPr>
-          <w:p>
-            <w:r/>
-            <w:r>
-              <w:rPr>
-                <w:sz w:val="20"/>
-              </w:rPr>
-              <w:t>5</w:t>
-            </w:r>
-          </w:p>
-        </w:tc>
-        <w:tc>
-          <w:tcPr>
-            <w:tcW w:type="dxa" w:w="1080"/>
-          </w:tcPr>
-          <w:p>
-            <w:r/>
-            <w:r>
-              <w:rPr>
-                <w:sz w:val="20"/>
-              </w:rPr>
-              <w:t>7</w:t>
-            </w:r>
-          </w:p>
-        </w:tc>
-        <w:tc>
-          <w:tcPr>
-            <w:tcW w:type="dxa" w:w="1080"/>
-          </w:tcPr>
-          <w:p>
-            <w:r/>
-            <w:r>
-              <w:rPr>
-                <w:sz w:val="20"/>
-              </w:rPr>
-              <w:t>5.17</w:t>
-            </w:r>
-          </w:p>
-        </w:tc>
-        <w:tc>
-          <w:tcPr>
-            <w:tcW w:type="dxa" w:w="1080"/>
-          </w:tcPr>
-          <w:p>
-            <w:r/>
-            <w:r>
-              <w:rPr>
-                <w:sz w:val="20"/>
-              </w:rPr>
-              <w:t>0.25</w:t>
-            </w:r>
-          </w:p>
-        </w:tc>
-      </w:tr>
-      <w:tr>
-        <w:tc>
-          <w:tcPr>
-            <w:tcW w:type="dxa" w:w="1080"/>
-          </w:tcPr>
-          <w:p>
-            <w:r/>
-            <w:r>
-              <w:rPr>
-                <w:sz w:val="20"/>
-              </w:rPr>
-              <w:t>Invoice &amp; Payment Module</w:t>
-            </w:r>
-          </w:p>
-        </w:tc>
-        <w:tc>
-          <w:tcPr>
-            <w:tcW w:type="dxa" w:w="1080"/>
-          </w:tcPr>
-          <w:p>
-            <w:r/>
-            <w:r>
-              <w:rPr>
-                <w:sz w:val="20"/>
-              </w:rPr>
-              <w:t>T11</w:t>
-            </w:r>
-          </w:p>
-        </w:tc>
-        <w:tc>
-          <w:tcPr>
-            <w:tcW w:type="dxa" w:w="1080"/>
-          </w:tcPr>
-          <w:p>
-            <w:r/>
-            <w:r>
-              <w:rPr>
-                <w:sz w:val="20"/>
-              </w:rPr>
-              <w:t>T10</w:t>
-            </w:r>
-          </w:p>
-        </w:tc>
-        <w:tc>
-          <w:tcPr>
-            <w:tcW w:type="dxa" w:w="1080"/>
-          </w:tcPr>
-          <w:p>
-            <w:r/>
-            <w:r>
-              <w:rPr>
-                <w:sz w:val="20"/>
-              </w:rPr>
-              <w:t>4</w:t>
-            </w:r>
-          </w:p>
-        </w:tc>
-        <w:tc>
-          <w:tcPr>
-            <w:tcW w:type="dxa" w:w="1080"/>
-          </w:tcPr>
-          <w:p>
-            <w:r/>
-            <w:r>
-              <w:rPr>
-                <w:sz w:val="20"/>
-              </w:rPr>
-              <w:t>6</w:t>
-            </w:r>
-          </w:p>
-        </w:tc>
-        <w:tc>
-          <w:tcPr>
-            <w:tcW w:type="dxa" w:w="1080"/>
-          </w:tcPr>
-          <w:p>
-            <w:r/>
-            <w:r>
-              <w:rPr>
-                <w:sz w:val="20"/>
-              </w:rPr>
-              <w:t>8</w:t>
-            </w:r>
-          </w:p>
-        </w:tc>
-        <w:tc>
-          <w:tcPr>
-            <w:tcW w:type="dxa" w:w="1080"/>
-          </w:tcPr>
-          <w:p>
-            <w:r/>
-            <w:r>
-              <w:rPr>
-                <w:sz w:val="20"/>
-              </w:rPr>
-              <w:t>6</w:t>
-            </w:r>
-          </w:p>
-        </w:tc>
-        <w:tc>
-          <w:tcPr>
-            <w:tcW w:type="dxa" w:w="1080"/>
-          </w:tcPr>
-          <w:p>
-            <w:r/>
-            <w:r>
-              <w:rPr>
-                <w:sz w:val="20"/>
-              </w:rPr>
-              <w:t>0.44</w:t>
-            </w:r>
-          </w:p>
-        </w:tc>
-      </w:tr>
-      <w:tr>
-        <w:tc>
-          <w:tcPr>
-            <w:tcW w:type="dxa" w:w="1080"/>
-          </w:tcPr>
-          <w:p>
-            <w:r/>
-            <w:r>
-              <w:rPr>
-                <w:sz w:val="20"/>
-              </w:rPr>
-              <w:t>Mess-Off &amp; Menu Management Module</w:t>
-            </w:r>
-          </w:p>
-        </w:tc>
-        <w:tc>
-          <w:tcPr>
-            <w:tcW w:type="dxa" w:w="1080"/>
-          </w:tcPr>
-          <w:p>
-            <w:r/>
-            <w:r>
-              <w:rPr>
-                <w:sz w:val="20"/>
-              </w:rPr>
-              <w:t>T12</w:t>
-            </w:r>
-          </w:p>
-        </w:tc>
-        <w:tc>
-          <w:tcPr>
-            <w:tcW w:type="dxa" w:w="1080"/>
-          </w:tcPr>
-          <w:p>
-            <w:r/>
-            <w:r>
-              <w:rPr>
-                <w:sz w:val="20"/>
-              </w:rPr>
-              <w:t>T9</w:t>
-            </w:r>
-          </w:p>
-        </w:tc>
-        <w:tc>
-          <w:tcPr>
-            <w:tcW w:type="dxa" w:w="1080"/>
-          </w:tcPr>
-          <w:p>
-            <w:r/>
-            <w:r>
-              <w:rPr>
-                <w:sz w:val="20"/>
-              </w:rPr>
-              <w:t>3</w:t>
-            </w:r>
-          </w:p>
-        </w:tc>
-        <w:tc>
-          <w:tcPr>
-            <w:tcW w:type="dxa" w:w="1080"/>
-          </w:tcPr>
-          <w:p>
-            <w:r/>
-            <w:r>
-              <w:rPr>
-                <w:sz w:val="20"/>
-              </w:rPr>
-              <w:t>4</w:t>
-            </w:r>
-          </w:p>
-        </w:tc>
-        <w:tc>
-          <w:tcPr>
-            <w:tcW w:type="dxa" w:w="1080"/>
-          </w:tcPr>
-          <w:p>
-            <w:r/>
-            <w:r>
-              <w:rPr>
-                <w:sz w:val="20"/>
-              </w:rPr>
-              <w:t>5</w:t>
-            </w:r>
-          </w:p>
-        </w:tc>
-        <w:tc>
-          <w:tcPr>
-            <w:tcW w:type="dxa" w:w="1080"/>
-          </w:tcPr>
-          <w:p>
-            <w:r/>
-            <w:r>
-              <w:rPr>
-                <w:sz w:val="20"/>
-              </w:rPr>
-              <w:t>4</w:t>
-            </w:r>
-          </w:p>
-        </w:tc>
-        <w:tc>
-          <w:tcPr>
-            <w:tcW w:type="dxa" w:w="1080"/>
-          </w:tcPr>
-          <w:p>
-            <w:r/>
-            <w:r>
-              <w:rPr>
-                <w:sz w:val="20"/>
-              </w:rPr>
-              <w:t>0.11</w:t>
-            </w:r>
-          </w:p>
-        </w:tc>
-      </w:tr>
-      <w:tr>
-        <w:tc>
-          <w:tcPr>
-            <w:tcW w:type="dxa" w:w="1080"/>
-          </w:tcPr>
-          <w:p>
-            <w:r/>
-            <w:r>
-              <w:rPr>
-                <w:sz w:val="20"/>
-              </w:rPr>
-              <w:t>Visitor &amp; Parcel Management Module</w:t>
-            </w:r>
-          </w:p>
-        </w:tc>
-        <w:tc>
-          <w:tcPr>
-            <w:tcW w:type="dxa" w:w="1080"/>
-          </w:tcPr>
-          <w:p>
-            <w:r/>
-            <w:r>
-              <w:rPr>
-                <w:sz w:val="20"/>
-              </w:rPr>
-              <w:t>T13</w:t>
-            </w:r>
-          </w:p>
-        </w:tc>
-        <w:tc>
-          <w:tcPr>
-            <w:tcW w:type="dxa" w:w="1080"/>
-          </w:tcPr>
-          <w:p>
-            <w:r/>
-            <w:r>
-              <w:rPr>
-                <w:sz w:val="20"/>
-              </w:rPr>
-              <w:t>T8, T9</w:t>
-            </w:r>
-          </w:p>
-        </w:tc>
-        <w:tc>
-          <w:tcPr>
-            <w:tcW w:type="dxa" w:w="1080"/>
-          </w:tcPr>
-          <w:p>
-            <w:r/>
-            <w:r>
-              <w:rPr>
-                <w:sz w:val="20"/>
-              </w:rPr>
-              <w:t>3</w:t>
-            </w:r>
-          </w:p>
-        </w:tc>
-        <w:tc>
-          <w:tcPr>
-            <w:tcW w:type="dxa" w:w="1080"/>
-          </w:tcPr>
-          <w:p>
-            <w:r/>
-            <w:r>
-              <w:rPr>
-                <w:sz w:val="20"/>
-              </w:rPr>
-              <w:t>4</w:t>
-            </w:r>
-          </w:p>
-        </w:tc>
-        <w:tc>
-          <w:tcPr>
-            <w:tcW w:type="dxa" w:w="1080"/>
-          </w:tcPr>
-          <w:p>
-            <w:r/>
-            <w:r>
-              <w:rPr>
-                <w:sz w:val="20"/>
-              </w:rPr>
-              <w:t>6</w:t>
-            </w:r>
-          </w:p>
-        </w:tc>
-        <w:tc>
-          <w:tcPr>
-            <w:tcW w:type="dxa" w:w="1080"/>
-          </w:tcPr>
-          <w:p>
-            <w:r/>
-            <w:r>
-              <w:rPr>
-                <w:sz w:val="20"/>
-              </w:rPr>
-              <w:t>4.17</w:t>
-            </w:r>
-          </w:p>
-        </w:tc>
-        <w:tc>
-          <w:tcPr>
-            <w:tcW w:type="dxa" w:w="1080"/>
-          </w:tcPr>
-          <w:p>
-            <w:r/>
-            <w:r>
-              <w:rPr>
-                <w:sz w:val="20"/>
-              </w:rPr>
-              <w:t>0.25</w:t>
-            </w:r>
-          </w:p>
-        </w:tc>
-      </w:tr>
-      <w:tr>
-        <w:tc>
-          <w:tcPr>
-            <w:tcW w:type="dxa" w:w="1080"/>
-          </w:tcPr>
-          <w:p>
-            <w:r/>
-            <w:r>
-              <w:rPr>
-                <w:sz w:val="20"/>
-              </w:rPr>
-              <w:t>Complaint &amp; Feedback Module</w:t>
-            </w:r>
-          </w:p>
-        </w:tc>
-        <w:tc>
-          <w:tcPr>
-            <w:tcW w:type="dxa" w:w="1080"/>
-          </w:tcPr>
-          <w:p>
-            <w:r/>
-            <w:r>
-              <w:rPr>
-                <w:sz w:val="20"/>
-              </w:rPr>
-              <w:t>T14</w:t>
-            </w:r>
-          </w:p>
-        </w:tc>
-        <w:tc>
-          <w:tcPr>
-            <w:tcW w:type="dxa" w:w="1080"/>
-          </w:tcPr>
-          <w:p>
-            <w:r/>
-            <w:r>
-              <w:rPr>
-                <w:sz w:val="20"/>
-              </w:rPr>
-              <w:t>T8, T9</w:t>
-            </w:r>
-          </w:p>
-        </w:tc>
-        <w:tc>
-          <w:tcPr>
-            <w:tcW w:type="dxa" w:w="1080"/>
-          </w:tcPr>
-          <w:p>
-            <w:r/>
-            <w:r>
-              <w:rPr>
-                <w:sz w:val="20"/>
-              </w:rPr>
-              <w:t>3</w:t>
-            </w:r>
-          </w:p>
-        </w:tc>
-        <w:tc>
-          <w:tcPr>
-            <w:tcW w:type="dxa" w:w="1080"/>
-          </w:tcPr>
-          <w:p>
-            <w:r/>
-            <w:r>
-              <w:rPr>
-                <w:sz w:val="20"/>
-              </w:rPr>
-              <w:t>4</w:t>
-            </w:r>
-          </w:p>
-        </w:tc>
-        <w:tc>
-          <w:tcPr>
-            <w:tcW w:type="dxa" w:w="1080"/>
-          </w:tcPr>
-          <w:p>
-            <w:r/>
-            <w:r>
-              <w:rPr>
-                <w:sz w:val="20"/>
-              </w:rPr>
-              <w:t>5</w:t>
-            </w:r>
-          </w:p>
-        </w:tc>
-        <w:tc>
-          <w:tcPr>
-            <w:tcW w:type="dxa" w:w="1080"/>
-          </w:tcPr>
-          <w:p>
-            <w:r/>
-            <w:r>
-              <w:rPr>
-                <w:sz w:val="20"/>
-              </w:rPr>
-              <w:t>4</w:t>
-            </w:r>
-          </w:p>
-        </w:tc>
-        <w:tc>
-          <w:tcPr>
-            <w:tcW w:type="dxa" w:w="1080"/>
-          </w:tcPr>
-          <w:p>
-            <w:r/>
-            <w:r>
-              <w:rPr>
-                <w:sz w:val="20"/>
-              </w:rPr>
-              <w:t>0.11</w:t>
-            </w:r>
-          </w:p>
-        </w:tc>
-      </w:tr>
-      <w:tr>
-        <w:tc>
-          <w:tcPr>
-            <w:tcW w:type="dxa" w:w="1080"/>
-          </w:tcPr>
-          <w:p>
-            <w:r/>
-            <w:r>
-              <w:rPr>
-                <w:sz w:val="20"/>
-              </w:rPr>
-              <w:t>Frontend Integration &amp; Design</w:t>
-            </w:r>
-          </w:p>
-        </w:tc>
-        <w:tc>
-          <w:tcPr>
-            <w:tcW w:type="dxa" w:w="1080"/>
-          </w:tcPr>
-          <w:p>
-            <w:r/>
-            <w:r>
-              <w:rPr>
-                <w:sz w:val="20"/>
-              </w:rPr>
-              <w:t>T15</w:t>
-            </w:r>
-          </w:p>
-        </w:tc>
-        <w:tc>
-          <w:tcPr>
-            <w:tcW w:type="dxa" w:w="1080"/>
-          </w:tcPr>
-          <w:p>
-            <w:r/>
-            <w:r>
-              <w:rPr>
-                <w:sz w:val="20"/>
-              </w:rPr>
-              <w:t>T6, T8, T9</w:t>
-            </w:r>
-          </w:p>
-        </w:tc>
-        <w:tc>
-          <w:tcPr>
-            <w:tcW w:type="dxa" w:w="1080"/>
-          </w:tcPr>
-          <w:p>
-            <w:r/>
-            <w:r>
-              <w:rPr>
-                <w:sz w:val="20"/>
-              </w:rPr>
-              <w:t>4</w:t>
-            </w:r>
-          </w:p>
-        </w:tc>
-        <w:tc>
-          <w:tcPr>
-            <w:tcW w:type="dxa" w:w="1080"/>
-          </w:tcPr>
-          <w:p>
-            <w:r/>
-            <w:r>
-              <w:rPr>
-                <w:sz w:val="20"/>
-              </w:rPr>
-              <w:t>5</w:t>
-            </w:r>
-          </w:p>
-        </w:tc>
-        <w:tc>
-          <w:tcPr>
-            <w:tcW w:type="dxa" w:w="1080"/>
-          </w:tcPr>
-          <w:p>
-            <w:r/>
-            <w:r>
-              <w:rPr>
-                <w:sz w:val="20"/>
-              </w:rPr>
-              <w:t>7</w:t>
-            </w:r>
-          </w:p>
-        </w:tc>
-        <w:tc>
-          <w:tcPr>
-            <w:tcW w:type="dxa" w:w="1080"/>
-          </w:tcPr>
-          <w:p>
-            <w:r/>
-            <w:r>
-              <w:rPr>
-                <w:sz w:val="20"/>
-              </w:rPr>
-              <w:t>5.17</w:t>
-            </w:r>
-          </w:p>
-        </w:tc>
-        <w:tc>
-          <w:tcPr>
-            <w:tcW w:type="dxa" w:w="1080"/>
-          </w:tcPr>
-          <w:p>
-            <w:r/>
-            <w:r>
-              <w:rPr>
-                <w:sz w:val="20"/>
-              </w:rPr>
-              <w:t>0.25</w:t>
-            </w:r>
-          </w:p>
-        </w:tc>
-      </w:tr>
-      <w:tr>
-        <w:tc>
-          <w:tcPr>
-            <w:tcW w:type="dxa" w:w="1080"/>
+            <w:tcW w:type="dxa" w:w="4320"/>
           </w:tcPr>
           <w:p>
             <w:r/>
@@ -2537,7 +971,7 @@
         </w:tc>
         <w:tc>
           <w:tcPr>
-            <w:tcW w:type="dxa" w:w="1080"/>
+            <w:tcW w:type="dxa" w:w="4320"/>
           </w:tcPr>
           <w:p>
             <w:r/>
@@ -2545,91 +979,7 @@
               <w:rPr>
                 <w:sz w:val="20"/>
               </w:rPr>
-              <w:t>T16</w:t>
-            </w:r>
-          </w:p>
-        </w:tc>
-        <w:tc>
-          <w:tcPr>
-            <w:tcW w:type="dxa" w:w="1080"/>
-          </w:tcPr>
-          <w:p>
-            <w:r/>
-            <w:r>
-              <w:rPr>
-                <w:sz w:val="20"/>
-              </w:rPr>
-              <w:t>T11–T15</w:t>
-            </w:r>
-          </w:p>
-        </w:tc>
-        <w:tc>
-          <w:tcPr>
-            <w:tcW w:type="dxa" w:w="1080"/>
-          </w:tcPr>
-          <w:p>
-            <w:r/>
-            <w:r>
-              <w:rPr>
-                <w:sz w:val="20"/>
-              </w:rPr>
-              <w:t>7</w:t>
-            </w:r>
-          </w:p>
-        </w:tc>
-        <w:tc>
-          <w:tcPr>
-            <w:tcW w:type="dxa" w:w="1080"/>
-          </w:tcPr>
-          <w:p>
-            <w:r/>
-            <w:r>
-              <w:rPr>
-                <w:sz w:val="20"/>
-              </w:rPr>
-              <w:t>10</w:t>
-            </w:r>
-          </w:p>
-        </w:tc>
-        <w:tc>
-          <w:tcPr>
-            <w:tcW w:type="dxa" w:w="1080"/>
-          </w:tcPr>
-          <w:p>
-            <w:r/>
-            <w:r>
-              <w:rPr>
-                <w:sz w:val="20"/>
-              </w:rPr>
-              <w:t>13</w:t>
-            </w:r>
-          </w:p>
-        </w:tc>
-        <w:tc>
-          <w:tcPr>
-            <w:tcW w:type="dxa" w:w="1080"/>
-          </w:tcPr>
-          <w:p>
-            <w:r/>
-            <w:r>
-              <w:rPr>
-                <w:sz w:val="20"/>
-              </w:rPr>
-              <w:t>10</w:t>
-            </w:r>
-          </w:p>
-        </w:tc>
-        <w:tc>
-          <w:tcPr>
-            <w:tcW w:type="dxa" w:w="1080"/>
-          </w:tcPr>
-          <w:p>
-            <w:r/>
-            <w:r>
-              <w:rPr>
-                <w:sz w:val="20"/>
-              </w:rPr>
-              <w:t>1</w:t>
+              <w:t>7–13 days</w:t>
             </w:r>
           </w:p>
         </w:tc>
@@ -2637,7 +987,7 @@
       <w:tr>
         <w:tc>
           <w:tcPr>
-            <w:tcW w:type="dxa" w:w="1080"/>
+            <w:tcW w:type="dxa" w:w="4320"/>
           </w:tcPr>
           <w:p>
             <w:r/>
@@ -2651,7 +1001,7 @@
         </w:tc>
         <w:tc>
           <w:tcPr>
-            <w:tcW w:type="dxa" w:w="1080"/>
+            <w:tcW w:type="dxa" w:w="4320"/>
           </w:tcPr>
           <w:p>
             <w:r/>
@@ -2659,13 +1009,15 @@
               <w:rPr>
                 <w:sz w:val="20"/>
               </w:rPr>
-              <w:t>T17</w:t>
+              <w:t>3–7 days</w:t>
             </w:r>
           </w:p>
         </w:tc>
+      </w:tr>
+      <w:tr>
         <w:tc>
           <w:tcPr>
-            <w:tcW w:type="dxa" w:w="1080"/>
+            <w:tcW w:type="dxa" w:w="4320"/>
           </w:tcPr>
           <w:p>
             <w:r/>
@@ -2673,13 +1025,13 @@
               <w:rPr>
                 <w:sz w:val="20"/>
               </w:rPr>
-              <w:t>T16</w:t>
+              <w:t>Total Estimated Time (PERT expected)</w:t>
             </w:r>
           </w:p>
         </w:tc>
         <w:tc>
           <w:tcPr>
-            <w:tcW w:type="dxa" w:w="1080"/>
+            <w:tcW w:type="dxa" w:w="4320"/>
           </w:tcPr>
           <w:p>
             <w:r/>
@@ -2687,63 +1039,7 @@
               <w:rPr>
                 <w:sz w:val="20"/>
               </w:rPr>
-              <w:t>3</w:t>
-            </w:r>
-          </w:p>
-        </w:tc>
-        <w:tc>
-          <w:tcPr>
-            <w:tcW w:type="dxa" w:w="1080"/>
-          </w:tcPr>
-          <w:p>
-            <w:r/>
-            <w:r>
-              <w:rPr>
-                <w:sz w:val="20"/>
-              </w:rPr>
-              <w:t>5</w:t>
-            </w:r>
-          </w:p>
-        </w:tc>
-        <w:tc>
-          <w:tcPr>
-            <w:tcW w:type="dxa" w:w="1080"/>
-          </w:tcPr>
-          <w:p>
-            <w:r/>
-            <w:r>
-              <w:rPr>
-                <w:sz w:val="20"/>
-              </w:rPr>
-              <w:t>7</w:t>
-            </w:r>
-          </w:p>
-        </w:tc>
-        <w:tc>
-          <w:tcPr>
-            <w:tcW w:type="dxa" w:w="1080"/>
-          </w:tcPr>
-          <w:p>
-            <w:r/>
-            <w:r>
-              <w:rPr>
-                <w:sz w:val="20"/>
-              </w:rPr>
-              <w:t>5</w:t>
-            </w:r>
-          </w:p>
-        </w:tc>
-        <w:tc>
-          <w:tcPr>
-            <w:tcW w:type="dxa" w:w="1080"/>
-          </w:tcPr>
-          <w:p>
-            <w:r/>
-            <w:r>
-              <w:rPr>
-                <w:sz w:val="20"/>
-              </w:rPr>
-              <w:t>0.44</w:t>
+              <w:t>≈ 60 days (~2 months)</w:t>
             </w:r>
           </w:p>
         </w:tc>
@@ -2763,16 +1059,15 @@
           <w:b/>
           <w:sz w:val="24"/>
         </w:rPr>
-        <w:t>3.2 PERT Calculation Summary</w:t>
+        <w:t>3.2 PERT Analysis Summary</w:t>
       </w:r>
     </w:p>
     <w:p>
       <w:pPr>
-        <w:pStyle w:val="ListBullet"/>
-        <w:spacing w:after="20"/>
+        <w:spacing w:after="40"/>
       </w:pPr>
       <w:r>
-        <w:t>Expected project length (critical path): T1 + T2 + T3 + T4 + T6 + T7 + T9 + T10 + T11 + T16 + T17 = 3 + 5 + 4 + 4 + 8 + 7 + 7 + 5.17 + 6 + 10 + 5 = 64.17 days</w:t>
+        <w:t>PERT (Program Evaluation and Review Technique) uses three estimates per task — Optimistic (to), Most Likely (tm) and Pessimistic (tp) — with the expected duration te = (to + 4tm + tp) / 6 and variance σ² = ((tp − to) / 6)². The critical path determines the expected project length:</w:t>
       </w:r>
     </w:p>
     <w:p>
@@ -2781,7 +1076,7 @@
         <w:spacing w:after="20"/>
       </w:pPr>
       <w:r>
-        <w:t>Project critical path: 1 → 2 → 3 → 4 → 7 → 5 → 8 → 10 → 11 → 13 → 16 → 17</w:t>
+        <w:t>Expected project length (critical path): T1 + T2 + T3 + T6 + T7 + T9 + T10 + T11 + T16 + T17 = 3 + 5 + 4 + 8 + 7 + 7 + 5.17 + 6 + 10 + 5 = 60.17 days</w:t>
       </w:r>
     </w:p>
     <w:p>
@@ -2790,7 +1085,16 @@
         <w:spacing w:after="20"/>
       </w:pPr>
       <w:r>
-        <w:t>Project length variance, σ² = 0.11 + 0.44 + 0.44 + 0.11 + 0.44 + 0.44 + 0.44 + 0.25 + 0.44 + 1 + 0.44 = 4.55</w:t>
+        <w:t>Project critical path: T1 → T2 → T3 → T6 → T7 → T9 → T10 → T11 → T16 → T17</w:t>
+      </w:r>
+    </w:p>
+    <w:p>
+      <w:pPr>
+        <w:pStyle w:val="ListBullet"/>
+        <w:spacing w:after="20"/>
+      </w:pPr>
+      <w:r>
+        <w:t>Project length variance, σ² = 0.11 + 0.44 + 0.44 + 0.44 + 0.44 + 0.25 + 0.44 + 1 + 0.44 = 4.55</w:t>
       </w:r>
     </w:p>
     <w:p>
@@ -2808,7 +1112,7 @@
         <w:spacing w:after="20"/>
       </w:pPr>
       <w:r>
-        <w:t>With σ = 2.13, there is a high probability the project finishes within approximately 64 ± 4 days — roughly 2 to 2.5 months.</w:t>
+        <w:t>With σ = 2.13, the project is highly likely to finish within approximately 60.17 ± 4 days (≈ 56–64 days) — roughly 2 months.</w:t>
       </w:r>
     </w:p>
     <w:p>
@@ -2820,7 +1124,7 @@
           <w:b/>
           <w:sz w:val="24"/>
         </w:rPr>
-        <w:t>3.3 Deployment (Already Completed)</w:t>
+        <w:t>3.3 Project Status</w:t>
       </w:r>
     </w:p>
     <w:p>
@@ -2828,7 +1132,41 @@
         <w:spacing w:after="40"/>
       </w:pPr>
       <w:r>
-        <w:t>Development is complete and the system is already deployed. The live web copy runs on Render with an Aiven MySQL database over TLS, and a GET /healthz endpoint reports status for uptime monitors. Deployment to the free hosting took approximately 2 days (one-time database import + web service setup + environment variables).</w:t>
+        <w:t>At this stage, the Hostel Management System has completed the planning, design, and development phases and is in final deployment. The system was developed within the PERT-estimated timeline, and testing confirmed that all core features work correctly before release.</w:t>
+      </w:r>
+    </w:p>
+    <w:p>
+      <w:pPr>
+        <w:spacing w:after="40"/>
+      </w:pPr>
+      <w:r>
+        <w:t>Deployment was straightforward:</w:t>
+      </w:r>
+    </w:p>
+    <w:p>
+      <w:pPr>
+        <w:pStyle w:val="ListBullet"/>
+        <w:spacing w:after="20"/>
+      </w:pPr>
+      <w:r>
+        <w:t>Day 1: Install Python/Flask/MySQL stack, import the database schema, configure project files.</w:t>
+      </w:r>
+    </w:p>
+    <w:p>
+      <w:pPr>
+        <w:pStyle w:val="ListBullet"/>
+        <w:spacing w:after="20"/>
+      </w:pPr>
+      <w:r>
+        <w:t>Day 2: Test login modules, verify core features, conduct initial user training.</w:t>
+      </w:r>
+    </w:p>
+    <w:p>
+      <w:pPr>
+        <w:spacing w:after="40"/>
+      </w:pPr>
+      <w:r>
+        <w:t>The system is already running live on Render with an Aiven MySQL database over TLS, and a GET /healthz endpoint reports status for uptime monitors.</w:t>
       </w:r>
     </w:p>
     <w:p>

</xml_diff>